<commit_message>
moscow, orientatie en planning
</commit_message>
<xml_diff>
--- a/LO2/analyse document.docx
+++ b/LO2/analyse document.docx
@@ -1393,7 +1393,6 @@
         <w:rPr>
           <w:b/>
           <w:bCs/>
-          <w:lang w:val="en-NL"/>
         </w:rPr>
       </w:pPr>
       <w:proofErr w:type="spellStart"/>
@@ -1401,7 +1400,6 @@
         <w:rPr>
           <w:b/>
           <w:bCs/>
-          <w:lang w:val="en-NL"/>
         </w:rPr>
         <w:t>Fysieke</w:t>
       </w:r>
@@ -1410,7 +1408,6 @@
         <w:rPr>
           <w:b/>
           <w:bCs/>
-          <w:lang w:val="en-NL"/>
         </w:rPr>
         <w:t xml:space="preserve"> </w:t>
       </w:r>
@@ -1419,96 +1416,57 @@
         <w:rPr>
           <w:b/>
           <w:bCs/>
-          <w:lang w:val="en-NL"/>
         </w:rPr>
         <w:t>kenmerken</w:t>
       </w:r>
       <w:proofErr w:type="spellEnd"/>
     </w:p>
     <w:p>
-      <w:pPr>
-        <w:rPr>
-          <w:lang w:val="en-NL"/>
-        </w:rPr>
-      </w:pPr>
-      <w:proofErr w:type="spellStart"/>
-      <w:r>
-        <w:rPr>
-          <w:lang w:val="en-NL"/>
-        </w:rPr>
+      <w:proofErr w:type="spellStart"/>
+      <w:r>
         <w:t>Afmetingen</w:t>
       </w:r>
       <w:proofErr w:type="spellEnd"/>
       <w:r>
-        <w:rPr>
-          <w:lang w:val="en-NL"/>
-        </w:rPr>
         <w:t xml:space="preserve">: 216 × 216 × 58 mm (8.5 × 8.5 × 2.3 inch). </w:t>
       </w:r>
       <w:proofErr w:type="spellStart"/>
       <w:r>
-        <w:rPr>
-          <w:lang w:val="en-NL"/>
-        </w:rPr>
         <w:t>Gewicht</w:t>
       </w:r>
       <w:proofErr w:type="spellEnd"/>
       <w:r>
-        <w:rPr>
-          <w:lang w:val="en-NL"/>
-        </w:rPr>
         <w:t xml:space="preserve">: 2.08 kg (Performance) of 1.87 kg (Entry), </w:t>
       </w:r>
       <w:proofErr w:type="spellStart"/>
       <w:r>
-        <w:rPr>
-          <w:lang w:val="en-NL"/>
-        </w:rPr>
         <w:t>exclusief</w:t>
       </w:r>
       <w:proofErr w:type="spellEnd"/>
       <w:r>
-        <w:rPr>
-          <w:lang w:val="en-NL"/>
-        </w:rPr>
         <w:t xml:space="preserve"> externe </w:t>
       </w:r>
       <w:proofErr w:type="spellStart"/>
       <w:r>
-        <w:rPr>
-          <w:lang w:val="en-NL"/>
-        </w:rPr>
         <w:t>voeding</w:t>
       </w:r>
       <w:proofErr w:type="spellEnd"/>
       <w:r>
-        <w:rPr>
-          <w:lang w:val="en-NL"/>
-        </w:rPr>
         <w:t xml:space="preserve">. </w:t>
       </w:r>
       <w:hyperlink r:id="rId5" w:tgtFrame="_blank" w:history="1">
         <w:r>
           <w:rPr>
             <w:rStyle w:val="Hyperlink"/>
-            <w:lang w:val="en-NL"/>
           </w:rPr>
           <w:t>HP</w:t>
         </w:r>
       </w:hyperlink>
     </w:p>
     <w:p>
-      <w:pPr>
-        <w:rPr>
-          <w:lang w:val="en-NL"/>
-        </w:rPr>
-      </w:pPr>
-      <w:r>
-        <w:rPr>
-          <w:lang w:val="en-NL"/>
-        </w:rPr>
+      <w:r>
         <w:pict w14:anchorId="25C6D265">
-          <v:rect id="_x0000_i1079" style="width:0;height:1.5pt" o:hralign="center" o:hrstd="t" o:hr="t" fillcolor="#a0a0a0" stroked="f"/>
+          <v:rect id="_x0000_i1025" style="width:0;height:1.5pt" o:hralign="center" o:hrstd="t" o:hr="t" fillcolor="#a0a0a0" stroked="f"/>
         </w:pict>
       </w:r>
     </w:p>
@@ -1517,239 +1475,141 @@
         <w:rPr>
           <w:b/>
           <w:bCs/>
-          <w:lang w:val="en-NL"/>
         </w:rPr>
       </w:pPr>
       <w:r>
         <w:rPr>
           <w:b/>
           <w:bCs/>
-          <w:lang w:val="en-NL"/>
         </w:rPr>
         <w:t>Processor</w:t>
       </w:r>
     </w:p>
     <w:p>
-      <w:pPr>
-        <w:rPr>
-          <w:lang w:val="en-NL"/>
-        </w:rPr>
-      </w:pPr>
-      <w:proofErr w:type="spellStart"/>
-      <w:r>
-        <w:rPr>
-          <w:lang w:val="en-NL"/>
-        </w:rPr>
+      <w:proofErr w:type="spellStart"/>
+      <w:r>
         <w:t>Keuze</w:t>
       </w:r>
       <w:proofErr w:type="spellEnd"/>
       <w:r>
-        <w:rPr>
-          <w:lang w:val="en-NL"/>
-        </w:rPr>
         <w:t xml:space="preserve"> </w:t>
       </w:r>
       <w:proofErr w:type="spellStart"/>
       <w:r>
-        <w:rPr>
-          <w:lang w:val="en-NL"/>
-        </w:rPr>
         <w:t>uit</w:t>
       </w:r>
       <w:proofErr w:type="spellEnd"/>
       <w:r>
-        <w:rPr>
-          <w:lang w:val="en-NL"/>
-        </w:rPr>
         <w:t xml:space="preserve"> 6e </w:t>
       </w:r>
       <w:proofErr w:type="spellStart"/>
       <w:r>
-        <w:rPr>
-          <w:lang w:val="en-NL"/>
-        </w:rPr>
         <w:t>generatie</w:t>
       </w:r>
       <w:proofErr w:type="spellEnd"/>
       <w:r>
-        <w:rPr>
-          <w:lang w:val="en-NL"/>
-        </w:rPr>
         <w:t xml:space="preserve"> Intel Core, 7e </w:t>
       </w:r>
       <w:proofErr w:type="spellStart"/>
       <w:r>
-        <w:rPr>
-          <w:lang w:val="en-NL"/>
-        </w:rPr>
         <w:t>generatie</w:t>
       </w:r>
       <w:proofErr w:type="spellEnd"/>
       <w:r>
-        <w:rPr>
-          <w:lang w:val="en-NL"/>
-        </w:rPr>
         <w:t xml:space="preserve"> Intel Core, of Intel Xeon E3-processors. De Intel C236-chipset </w:t>
       </w:r>
       <w:proofErr w:type="spellStart"/>
       <w:r>
-        <w:rPr>
-          <w:lang w:val="en-NL"/>
-        </w:rPr>
         <w:t>ondersteunt</w:t>
       </w:r>
       <w:proofErr w:type="spellEnd"/>
       <w:r>
-        <w:rPr>
-          <w:lang w:val="en-NL"/>
-        </w:rPr>
         <w:t xml:space="preserve"> 5e </w:t>
       </w:r>
       <w:proofErr w:type="spellStart"/>
       <w:r>
-        <w:rPr>
-          <w:lang w:val="en-NL"/>
-        </w:rPr>
         <w:t>generatie</w:t>
       </w:r>
       <w:proofErr w:type="spellEnd"/>
       <w:r>
-        <w:rPr>
-          <w:lang w:val="en-NL"/>
-        </w:rPr>
         <w:t xml:space="preserve"> Xeon (80W) </w:t>
       </w:r>
       <w:proofErr w:type="spellStart"/>
       <w:r>
-        <w:rPr>
-          <w:lang w:val="en-NL"/>
-        </w:rPr>
         <w:t>en</w:t>
       </w:r>
       <w:proofErr w:type="spellEnd"/>
       <w:r>
-        <w:rPr>
-          <w:lang w:val="en-NL"/>
-        </w:rPr>
         <w:t xml:space="preserve"> 6e </w:t>
       </w:r>
       <w:proofErr w:type="spellStart"/>
       <w:r>
-        <w:rPr>
-          <w:lang w:val="en-NL"/>
-        </w:rPr>
         <w:t>generatie</w:t>
       </w:r>
       <w:proofErr w:type="spellEnd"/>
       <w:r>
-        <w:rPr>
-          <w:lang w:val="en-NL"/>
-        </w:rPr>
         <w:t xml:space="preserve"> Core-processors (65W), met </w:t>
       </w:r>
       <w:proofErr w:type="spellStart"/>
       <w:r>
-        <w:rPr>
-          <w:lang w:val="en-NL"/>
-        </w:rPr>
         <w:t>een</w:t>
       </w:r>
       <w:proofErr w:type="spellEnd"/>
       <w:r>
-        <w:rPr>
-          <w:lang w:val="en-NL"/>
-        </w:rPr>
         <w:t xml:space="preserve"> </w:t>
       </w:r>
       <w:proofErr w:type="spellStart"/>
       <w:r>
-        <w:rPr>
-          <w:lang w:val="en-NL"/>
-        </w:rPr>
         <w:t>geïntegreerde</w:t>
       </w:r>
       <w:proofErr w:type="spellEnd"/>
       <w:r>
-        <w:rPr>
-          <w:lang w:val="en-NL"/>
-        </w:rPr>
         <w:t xml:space="preserve"> dual-channel </w:t>
       </w:r>
       <w:proofErr w:type="spellStart"/>
       <w:r>
-        <w:rPr>
-          <w:lang w:val="en-NL"/>
-        </w:rPr>
         <w:t>geheugencontroller</w:t>
       </w:r>
       <w:proofErr w:type="spellEnd"/>
       <w:r>
-        <w:rPr>
-          <w:lang w:val="en-NL"/>
-        </w:rPr>
         <w:t xml:space="preserve"> </w:t>
       </w:r>
       <w:proofErr w:type="spellStart"/>
       <w:r>
-        <w:rPr>
-          <w:lang w:val="en-NL"/>
-        </w:rPr>
         <w:t>en</w:t>
       </w:r>
       <w:proofErr w:type="spellEnd"/>
       <w:r>
-        <w:rPr>
-          <w:lang w:val="en-NL"/>
-        </w:rPr>
         <w:t xml:space="preserve"> Advanced Vector Extensions (AVX) </w:t>
       </w:r>
       <w:proofErr w:type="spellStart"/>
       <w:r>
-        <w:rPr>
-          <w:lang w:val="en-NL"/>
-        </w:rPr>
         <w:t>voor</w:t>
       </w:r>
       <w:proofErr w:type="spellEnd"/>
       <w:r>
-        <w:rPr>
-          <w:lang w:val="en-NL"/>
-        </w:rPr>
         <w:t xml:space="preserve"> </w:t>
       </w:r>
       <w:proofErr w:type="spellStart"/>
       <w:r>
-        <w:rPr>
-          <w:lang w:val="en-NL"/>
-        </w:rPr>
         <w:t>hogere</w:t>
       </w:r>
       <w:proofErr w:type="spellEnd"/>
       <w:r>
-        <w:rPr>
-          <w:lang w:val="en-NL"/>
-        </w:rPr>
         <w:t xml:space="preserve"> floating-point </w:t>
       </w:r>
       <w:proofErr w:type="spellStart"/>
       <w:r>
-        <w:rPr>
-          <w:lang w:val="en-NL"/>
-        </w:rPr>
         <w:t>prestaties</w:t>
       </w:r>
       <w:proofErr w:type="spellEnd"/>
       <w:r>
-        <w:rPr>
-          <w:lang w:val="en-NL"/>
-        </w:rPr>
         <w:t xml:space="preserve">. </w:t>
       </w:r>
       <w:hyperlink r:id="rId6" w:tgtFrame="_blank" w:history="1">
         <w:r>
           <w:rPr>
             <w:rStyle w:val="Hyperlink"/>
-            <w:lang w:val="en-NL"/>
           </w:rPr>
           <w:t xml:space="preserve">Windows </w:t>
         </w:r>
@@ -1757,7 +1617,6 @@
         <w:r>
           <w:rPr>
             <w:rStyle w:val="Hyperlink"/>
-            <w:lang w:val="en-NL"/>
           </w:rPr>
           <w:t>Central</w:t>
         </w:r>
@@ -1766,7 +1625,6 @@
         <w:r>
           <w:rPr>
             <w:rStyle w:val="Hyperlink"/>
-            <w:lang w:val="en-NL"/>
           </w:rPr>
           <w:t>HP</w:t>
         </w:r>
@@ -1774,17 +1632,9 @@
       </w:hyperlink>
     </w:p>
     <w:p>
-      <w:pPr>
-        <w:rPr>
-          <w:lang w:val="en-NL"/>
-        </w:rPr>
-      </w:pPr>
-      <w:r>
-        <w:rPr>
-          <w:lang w:val="en-NL"/>
-        </w:rPr>
+      <w:r>
         <w:pict w14:anchorId="57823AFE">
-          <v:rect id="_x0000_i1080" style="width:0;height:1.5pt" o:hralign="center" o:hrstd="t" o:hr="t" fillcolor="#a0a0a0" stroked="f"/>
+          <v:rect id="_x0000_i1026" style="width:0;height:1.5pt" o:hralign="center" o:hrstd="t" o:hr="t" fillcolor="#a0a0a0" stroked="f"/>
         </w:pict>
       </w:r>
     </w:p>
@@ -1793,7 +1643,6 @@
         <w:rPr>
           <w:b/>
           <w:bCs/>
-          <w:lang w:val="en-NL"/>
         </w:rPr>
       </w:pPr>
       <w:proofErr w:type="spellStart"/>
@@ -1801,74 +1650,44 @@
         <w:rPr>
           <w:b/>
           <w:bCs/>
-          <w:lang w:val="en-NL"/>
         </w:rPr>
         <w:t>Geheugen</w:t>
       </w:r>
       <w:proofErr w:type="spellEnd"/>
     </w:p>
     <w:p>
-      <w:pPr>
-        <w:rPr>
-          <w:lang w:val="en-NL"/>
-        </w:rPr>
-      </w:pPr>
-      <w:r>
-        <w:rPr>
-          <w:lang w:val="en-NL"/>
-        </w:rPr>
+      <w:r>
         <w:t>RAM-</w:t>
       </w:r>
       <w:proofErr w:type="spellStart"/>
       <w:r>
-        <w:rPr>
-          <w:lang w:val="en-NL"/>
-        </w:rPr>
         <w:t>opties</w:t>
       </w:r>
       <w:proofErr w:type="spellEnd"/>
       <w:r>
-        <w:rPr>
-          <w:lang w:val="en-NL"/>
-        </w:rPr>
         <w:t xml:space="preserve"> </w:t>
       </w:r>
       <w:proofErr w:type="spellStart"/>
       <w:r>
-        <w:rPr>
-          <w:lang w:val="en-NL"/>
-        </w:rPr>
         <w:t>lopen</w:t>
       </w:r>
       <w:proofErr w:type="spellEnd"/>
       <w:r>
-        <w:rPr>
-          <w:lang w:val="en-NL"/>
-        </w:rPr>
         <w:t xml:space="preserve"> op tot 32 GB DDR4. </w:t>
       </w:r>
       <w:hyperlink r:id="rId8" w:tgtFrame="_blank" w:history="1">
         <w:r>
           <w:rPr>
             <w:rStyle w:val="Hyperlink"/>
-            <w:lang w:val="en-NL"/>
           </w:rPr>
           <w:t>Windows Central</w:t>
         </w:r>
       </w:hyperlink>
     </w:p>
     <w:p>
-      <w:pPr>
-        <w:rPr>
-          <w:lang w:val="en-NL"/>
-        </w:rPr>
-      </w:pPr>
-      <w:r>
-        <w:rPr>
-          <w:lang w:val="en-NL"/>
-        </w:rPr>
+      <w:r>
         <w:pict w14:anchorId="3A1DF4FF">
-          <v:rect id="_x0000_i1081" style="width:0;height:1.5pt" o:hralign="center" o:hrstd="t" o:hr="t" fillcolor="#a0a0a0" stroked="f"/>
+          <v:rect id="_x0000_i1027" style="width:0;height:1.5pt" o:hralign="center" o:hrstd="t" o:hr="t" fillcolor="#a0a0a0" stroked="f"/>
         </w:pict>
       </w:r>
     </w:p>
@@ -1877,7 +1696,6 @@
         <w:rPr>
           <w:b/>
           <w:bCs/>
-          <w:lang w:val="en-NL"/>
         </w:rPr>
       </w:pPr>
       <w:proofErr w:type="spellStart"/>
@@ -1885,194 +1703,113 @@
         <w:rPr>
           <w:b/>
           <w:bCs/>
-          <w:lang w:val="en-NL"/>
         </w:rPr>
         <w:t>Opslag</w:t>
       </w:r>
       <w:proofErr w:type="spellEnd"/>
     </w:p>
     <w:p>
-      <w:pPr>
-        <w:rPr>
-          <w:lang w:val="en-NL"/>
-        </w:rPr>
-      </w:pPr>
-      <w:proofErr w:type="spellStart"/>
-      <w:r>
-        <w:rPr>
-          <w:lang w:val="en-NL"/>
-        </w:rPr>
+      <w:proofErr w:type="spellStart"/>
+      <w:r>
         <w:t>Configureerbaar</w:t>
       </w:r>
       <w:proofErr w:type="spellEnd"/>
       <w:r>
-        <w:rPr>
-          <w:lang w:val="en-NL"/>
-        </w:rPr>
         <w:t xml:space="preserve"> met </w:t>
       </w:r>
       <w:proofErr w:type="spellStart"/>
       <w:r>
-        <w:rPr>
-          <w:lang w:val="en-NL"/>
-        </w:rPr>
         <w:t>een</w:t>
       </w:r>
       <w:proofErr w:type="spellEnd"/>
       <w:r>
-        <w:rPr>
-          <w:lang w:val="en-NL"/>
-        </w:rPr>
         <w:t xml:space="preserve"> </w:t>
       </w:r>
       <w:proofErr w:type="spellStart"/>
       <w:r>
-        <w:rPr>
-          <w:lang w:val="en-NL"/>
-        </w:rPr>
         <w:t>combinatie</w:t>
       </w:r>
       <w:proofErr w:type="spellEnd"/>
       <w:r>
-        <w:rPr>
-          <w:lang w:val="en-NL"/>
-        </w:rPr>
         <w:t xml:space="preserve"> van SSD </w:t>
       </w:r>
       <w:proofErr w:type="spellStart"/>
       <w:r>
-        <w:rPr>
-          <w:lang w:val="en-NL"/>
-        </w:rPr>
         <w:t>en</w:t>
       </w:r>
       <w:proofErr w:type="spellEnd"/>
       <w:r>
-        <w:rPr>
-          <w:lang w:val="en-NL"/>
-        </w:rPr>
         <w:t xml:space="preserve"> HDD. In </w:t>
       </w:r>
       <w:proofErr w:type="spellStart"/>
       <w:r>
-        <w:rPr>
-          <w:lang w:val="en-NL"/>
-        </w:rPr>
         <w:t>testconfiguraties</w:t>
       </w:r>
       <w:proofErr w:type="spellEnd"/>
       <w:r>
-        <w:rPr>
-          <w:lang w:val="en-NL"/>
-        </w:rPr>
         <w:t xml:space="preserve"> </w:t>
       </w:r>
       <w:proofErr w:type="spellStart"/>
       <w:r>
-        <w:rPr>
-          <w:lang w:val="en-NL"/>
-        </w:rPr>
         <w:t>werden</w:t>
       </w:r>
       <w:proofErr w:type="spellEnd"/>
       <w:r>
-        <w:rPr>
-          <w:lang w:val="en-NL"/>
-        </w:rPr>
         <w:t xml:space="preserve"> </w:t>
       </w:r>
       <w:proofErr w:type="spellStart"/>
       <w:r>
-        <w:rPr>
-          <w:lang w:val="en-NL"/>
-        </w:rPr>
         <w:t>een</w:t>
       </w:r>
       <w:proofErr w:type="spellEnd"/>
       <w:r>
-        <w:rPr>
-          <w:lang w:val="en-NL"/>
-        </w:rPr>
         <w:t xml:space="preserve"> 256 GB HP Z Turbo Drive (</w:t>
       </w:r>
       <w:proofErr w:type="spellStart"/>
       <w:r>
-        <w:rPr>
-          <w:lang w:val="en-NL"/>
-        </w:rPr>
         <w:t>NVMe</w:t>
       </w:r>
       <w:proofErr w:type="spellEnd"/>
       <w:r>
-        <w:rPr>
-          <w:lang w:val="en-NL"/>
-        </w:rPr>
         <w:t xml:space="preserve"> SSD) </w:t>
       </w:r>
       <w:proofErr w:type="spellStart"/>
       <w:r>
-        <w:rPr>
-          <w:lang w:val="en-NL"/>
-        </w:rPr>
         <w:t>en</w:t>
       </w:r>
       <w:proofErr w:type="spellEnd"/>
       <w:r>
-        <w:rPr>
-          <w:lang w:val="en-NL"/>
-        </w:rPr>
         <w:t xml:space="preserve"> </w:t>
       </w:r>
       <w:proofErr w:type="spellStart"/>
       <w:r>
-        <w:rPr>
-          <w:lang w:val="en-NL"/>
-        </w:rPr>
         <w:t>een</w:t>
       </w:r>
       <w:proofErr w:type="spellEnd"/>
       <w:r>
-        <w:rPr>
-          <w:lang w:val="en-NL"/>
-        </w:rPr>
         <w:t xml:space="preserve"> 1 TB SATA HDD </w:t>
       </w:r>
       <w:proofErr w:type="spellStart"/>
       <w:r>
-        <w:rPr>
-          <w:lang w:val="en-NL"/>
-        </w:rPr>
         <w:t>gecombineerd</w:t>
       </w:r>
       <w:proofErr w:type="spellEnd"/>
       <w:r>
-        <w:rPr>
-          <w:lang w:val="en-NL"/>
-        </w:rPr>
         <w:t xml:space="preserve">. </w:t>
       </w:r>
       <w:hyperlink r:id="rId9" w:tgtFrame="_blank" w:history="1">
         <w:r>
           <w:rPr>
             <w:rStyle w:val="Hyperlink"/>
-            <w:lang w:val="en-NL"/>
           </w:rPr>
           <w:t>Windows Central</w:t>
         </w:r>
       </w:hyperlink>
     </w:p>
     <w:p>
-      <w:pPr>
-        <w:rPr>
-          <w:lang w:val="en-NL"/>
-        </w:rPr>
-      </w:pPr>
-      <w:r>
-        <w:rPr>
-          <w:lang w:val="en-NL"/>
-        </w:rPr>
+      <w:r>
         <w:pict w14:anchorId="2A4CA27F">
-          <v:rect id="_x0000_i1082" style="width:0;height:1.5pt" o:hralign="center" o:hrstd="t" o:hr="t" fillcolor="#a0a0a0" stroked="f"/>
+          <v:rect id="_x0000_i1028" style="width:0;height:1.5pt" o:hralign="center" o:hrstd="t" o:hr="t" fillcolor="#a0a0a0" stroked="f"/>
         </w:pict>
       </w:r>
     </w:p>
@@ -2081,220 +1818,129 @@
         <w:rPr>
           <w:b/>
           <w:bCs/>
-          <w:lang w:val="en-NL"/>
         </w:rPr>
       </w:pPr>
       <w:r>
         <w:rPr>
           <w:b/>
           <w:bCs/>
-          <w:lang w:val="en-NL"/>
         </w:rPr>
         <w:t>Graphics</w:t>
       </w:r>
     </w:p>
     <w:p>
-      <w:pPr>
-        <w:rPr>
-          <w:lang w:val="en-NL"/>
-        </w:rPr>
-      </w:pPr>
-      <w:r>
-        <w:rPr>
-          <w:lang w:val="en-NL"/>
-        </w:rPr>
+      <w:r>
         <w:t>Performance-</w:t>
       </w:r>
       <w:proofErr w:type="spellStart"/>
       <w:r>
-        <w:rPr>
-          <w:lang w:val="en-NL"/>
-        </w:rPr>
         <w:t>modellen</w:t>
       </w:r>
       <w:proofErr w:type="spellEnd"/>
       <w:r>
-        <w:rPr>
-          <w:lang w:val="en-NL"/>
-        </w:rPr>
         <w:t xml:space="preserve">: NVIDIA Quadro M620 met 2 GB, </w:t>
       </w:r>
       <w:proofErr w:type="spellStart"/>
       <w:r>
-        <w:rPr>
-          <w:lang w:val="en-NL"/>
-        </w:rPr>
         <w:t>kan</w:t>
       </w:r>
       <w:proofErr w:type="spellEnd"/>
       <w:r>
-        <w:rPr>
-          <w:lang w:val="en-NL"/>
-        </w:rPr>
         <w:t xml:space="preserve"> tot 4 </w:t>
       </w:r>
       <w:proofErr w:type="spellStart"/>
       <w:r>
-        <w:rPr>
-          <w:lang w:val="en-NL"/>
-        </w:rPr>
         <w:t>beeldschermen</w:t>
       </w:r>
       <w:proofErr w:type="spellEnd"/>
       <w:r>
-        <w:rPr>
-          <w:lang w:val="en-NL"/>
-        </w:rPr>
         <w:t xml:space="preserve"> </w:t>
       </w:r>
       <w:proofErr w:type="spellStart"/>
       <w:r>
-        <w:rPr>
-          <w:lang w:val="en-NL"/>
-        </w:rPr>
         <w:t>gelijktijdig</w:t>
       </w:r>
       <w:proofErr w:type="spellEnd"/>
       <w:r>
-        <w:rPr>
-          <w:lang w:val="en-NL"/>
-        </w:rPr>
         <w:t xml:space="preserve"> </w:t>
       </w:r>
       <w:proofErr w:type="spellStart"/>
       <w:r>
-        <w:rPr>
-          <w:lang w:val="en-NL"/>
-        </w:rPr>
         <w:t>aansturen</w:t>
       </w:r>
       <w:proofErr w:type="spellEnd"/>
       <w:r>
-        <w:rPr>
-          <w:lang w:val="en-NL"/>
-        </w:rPr>
         <w:t>. Entry-</w:t>
       </w:r>
       <w:proofErr w:type="spellStart"/>
       <w:r>
-        <w:rPr>
-          <w:lang w:val="en-NL"/>
-        </w:rPr>
         <w:t>modellen</w:t>
       </w:r>
       <w:proofErr w:type="spellEnd"/>
       <w:r>
-        <w:rPr>
-          <w:lang w:val="en-NL"/>
-        </w:rPr>
         <w:t xml:space="preserve">: Intel HD Graphics 510/530 (Core) of Intel HD Graphics P530 (Xeon), </w:t>
       </w:r>
       <w:proofErr w:type="spellStart"/>
       <w:r>
-        <w:rPr>
-          <w:lang w:val="en-NL"/>
-        </w:rPr>
         <w:t>geschikt</w:t>
       </w:r>
       <w:proofErr w:type="spellEnd"/>
       <w:r>
-        <w:rPr>
-          <w:lang w:val="en-NL"/>
-        </w:rPr>
         <w:t xml:space="preserve"> </w:t>
       </w:r>
       <w:proofErr w:type="spellStart"/>
       <w:r>
-        <w:rPr>
-          <w:lang w:val="en-NL"/>
-        </w:rPr>
         <w:t>voor</w:t>
       </w:r>
       <w:proofErr w:type="spellEnd"/>
       <w:r>
-        <w:rPr>
-          <w:lang w:val="en-NL"/>
-        </w:rPr>
         <w:t xml:space="preserve"> tot 3 </w:t>
       </w:r>
       <w:proofErr w:type="spellStart"/>
       <w:r>
-        <w:rPr>
-          <w:lang w:val="en-NL"/>
-        </w:rPr>
         <w:t>beeldschermen</w:t>
       </w:r>
       <w:proofErr w:type="spellEnd"/>
       <w:r>
-        <w:rPr>
-          <w:lang w:val="en-NL"/>
-        </w:rPr>
         <w:t>. Op Performance-</w:t>
       </w:r>
       <w:proofErr w:type="spellStart"/>
       <w:r>
-        <w:rPr>
-          <w:lang w:val="en-NL"/>
-        </w:rPr>
         <w:t>modellen</w:t>
       </w:r>
       <w:proofErr w:type="spellEnd"/>
       <w:r>
-        <w:rPr>
-          <w:lang w:val="en-NL"/>
-        </w:rPr>
         <w:t xml:space="preserve"> is de Intel HD Graphics </w:t>
       </w:r>
       <w:proofErr w:type="spellStart"/>
       <w:r>
-        <w:rPr>
-          <w:lang w:val="en-NL"/>
-        </w:rPr>
         <w:t>standaard</w:t>
       </w:r>
       <w:proofErr w:type="spellEnd"/>
       <w:r>
-        <w:rPr>
-          <w:lang w:val="en-NL"/>
-        </w:rPr>
         <w:t xml:space="preserve"> </w:t>
       </w:r>
       <w:proofErr w:type="spellStart"/>
       <w:r>
-        <w:rPr>
-          <w:lang w:val="en-NL"/>
-        </w:rPr>
         <w:t>uitgeschakeld</w:t>
       </w:r>
       <w:proofErr w:type="spellEnd"/>
       <w:r>
-        <w:rPr>
-          <w:lang w:val="en-NL"/>
-        </w:rPr>
         <w:t xml:space="preserve">. </w:t>
       </w:r>
       <w:hyperlink r:id="rId10" w:tgtFrame="_blank" w:history="1">
         <w:r>
           <w:rPr>
             <w:rStyle w:val="Hyperlink"/>
-            <w:lang w:val="en-NL"/>
           </w:rPr>
           <w:t>HP</w:t>
         </w:r>
       </w:hyperlink>
     </w:p>
     <w:p>
-      <w:pPr>
-        <w:rPr>
-          <w:lang w:val="en-NL"/>
-        </w:rPr>
-      </w:pPr>
-      <w:r>
-        <w:rPr>
-          <w:lang w:val="en-NL"/>
-        </w:rPr>
+      <w:r>
         <w:pict w14:anchorId="59029D07">
-          <v:rect id="_x0000_i1083" style="width:0;height:1.5pt" o:hralign="center" o:hrstd="t" o:hr="t" fillcolor="#a0a0a0" stroked="f"/>
+          <v:rect id="_x0000_i1029" style="width:0;height:1.5pt" o:hralign="center" o:hrstd="t" o:hr="t" fillcolor="#a0a0a0" stroked="f"/>
         </w:pict>
       </w:r>
     </w:p>
@@ -2303,14 +1949,12 @@
         <w:rPr>
           <w:b/>
           <w:bCs/>
-          <w:lang w:val="en-NL"/>
         </w:rPr>
       </w:pPr>
       <w:r>
         <w:rPr>
           <w:b/>
           <w:bCs/>
-          <w:lang w:val="en-NL"/>
         </w:rPr>
         <w:t xml:space="preserve">I/O &amp; </w:t>
       </w:r>
@@ -2319,7 +1963,6 @@
         <w:rPr>
           <w:b/>
           <w:bCs/>
-          <w:lang w:val="en-NL"/>
         </w:rPr>
         <w:t>connectiviteit</w:t>
       </w:r>
@@ -2328,129 +1971,75 @@
         <w:rPr>
           <w:b/>
           <w:bCs/>
-          <w:lang w:val="en-NL"/>
         </w:rPr>
         <w:t xml:space="preserve"> (Performance-model)</w:t>
       </w:r>
     </w:p>
     <w:p>
-      <w:pPr>
-        <w:rPr>
-          <w:lang w:val="en-NL"/>
-        </w:rPr>
-      </w:pPr>
-      <w:r>
-        <w:rPr>
-          <w:lang w:val="en-NL"/>
-        </w:rPr>
+      <w:r>
         <w:t xml:space="preserve">4× USB 3.0, 4× DisplayPort 1.2, 2× USB-C 3.1 Gen1, RJ-45 (LAN), </w:t>
       </w:r>
       <w:proofErr w:type="spellStart"/>
       <w:r>
-        <w:rPr>
-          <w:lang w:val="en-NL"/>
-        </w:rPr>
         <w:t>en</w:t>
       </w:r>
       <w:proofErr w:type="spellEnd"/>
       <w:r>
-        <w:rPr>
-          <w:lang w:val="en-NL"/>
-        </w:rPr>
         <w:t xml:space="preserve"> </w:t>
       </w:r>
       <w:proofErr w:type="spellStart"/>
       <w:r>
-        <w:rPr>
-          <w:lang w:val="en-NL"/>
-        </w:rPr>
         <w:t>een</w:t>
       </w:r>
       <w:proofErr w:type="spellEnd"/>
       <w:r>
-        <w:rPr>
-          <w:lang w:val="en-NL"/>
-        </w:rPr>
         <w:t xml:space="preserve"> headphone/</w:t>
       </w:r>
       <w:proofErr w:type="spellStart"/>
       <w:r>
-        <w:rPr>
-          <w:lang w:val="en-NL"/>
-        </w:rPr>
         <w:t>microfoon</w:t>
       </w:r>
       <w:proofErr w:type="spellEnd"/>
       <w:r>
-        <w:rPr>
-          <w:lang w:val="en-NL"/>
-        </w:rPr>
         <w:t xml:space="preserve"> </w:t>
       </w:r>
       <w:proofErr w:type="spellStart"/>
       <w:r>
-        <w:rPr>
-          <w:lang w:val="en-NL"/>
-        </w:rPr>
         <w:t>combojack</w:t>
       </w:r>
       <w:proofErr w:type="spellEnd"/>
       <w:r>
-        <w:rPr>
-          <w:lang w:val="en-NL"/>
-        </w:rPr>
         <w:t xml:space="preserve">. </w:t>
       </w:r>
       <w:proofErr w:type="spellStart"/>
       <w:r>
-        <w:rPr>
-          <w:lang w:val="en-NL"/>
-        </w:rPr>
         <w:t>Optioneel</w:t>
       </w:r>
       <w:proofErr w:type="spellEnd"/>
       <w:r>
-        <w:rPr>
-          <w:lang w:val="en-NL"/>
-        </w:rPr>
         <w:t xml:space="preserve">: WLAN </w:t>
       </w:r>
       <w:proofErr w:type="spellStart"/>
       <w:r>
-        <w:rPr>
-          <w:lang w:val="en-NL"/>
-        </w:rPr>
         <w:t>en</w:t>
       </w:r>
       <w:proofErr w:type="spellEnd"/>
       <w:r>
-        <w:rPr>
-          <w:lang w:val="en-NL"/>
-        </w:rPr>
         <w:t xml:space="preserve"> Bluetooth. </w:t>
       </w:r>
       <w:hyperlink r:id="rId11" w:tgtFrame="_blank" w:history="1">
         <w:r>
           <w:rPr>
             <w:rStyle w:val="Hyperlink"/>
-            <w:lang w:val="en-NL"/>
           </w:rPr>
           <w:t>HP</w:t>
         </w:r>
       </w:hyperlink>
     </w:p>
     <w:p>
-      <w:pPr>
-        <w:rPr>
-          <w:lang w:val="en-NL"/>
-        </w:rPr>
-      </w:pPr>
-      <w:r>
-        <w:rPr>
-          <w:lang w:val="en-NL"/>
-        </w:rPr>
+      <w:r>
         <w:pict w14:anchorId="544F0CE7">
-          <v:rect id="_x0000_i1084" style="width:0;height:1.5pt" o:hralign="center" o:hrstd="t" o:hr="t" fillcolor="#a0a0a0" stroked="f"/>
+          <v:rect id="_x0000_i1030" style="width:0;height:1.5pt" o:hralign="center" o:hrstd="t" o:hr="t" fillcolor="#a0a0a0" stroked="f"/>
         </w:pict>
       </w:r>
     </w:p>
@@ -2459,125 +2048,92 @@
         <w:rPr>
           <w:b/>
           <w:bCs/>
-          <w:lang w:val="en-NL"/>
-        </w:rPr>
-      </w:pPr>
-      <w:proofErr w:type="spellStart"/>
-      <w:r>
+        </w:rPr>
+      </w:pPr>
+    </w:p>
+    <w:p>
+      <w:pPr>
         <w:rPr>
           <w:b/>
           <w:bCs/>
-          <w:lang w:val="en-NL"/>
-        </w:rPr>
+        </w:rPr>
+      </w:pPr>
+    </w:p>
+    <w:p>
+      <w:pPr>
+        <w:rPr>
+          <w:b/>
+          <w:bCs/>
+        </w:rPr>
+      </w:pPr>
+      <w:proofErr w:type="spellStart"/>
+      <w:r>
+        <w:rPr>
+          <w:b/>
+          <w:bCs/>
+        </w:rPr>
+        <w:lastRenderedPageBreak/>
         <w:t>Voeding</w:t>
       </w:r>
       <w:proofErr w:type="spellEnd"/>
     </w:p>
     <w:p>
-      <w:pPr>
-        <w:rPr>
-          <w:lang w:val="en-NL"/>
-        </w:rPr>
-      </w:pPr>
-      <w:r>
-        <w:rPr>
-          <w:lang w:val="en-NL"/>
-        </w:rPr>
-        <w:lastRenderedPageBreak/>
+      <w:r>
         <w:t xml:space="preserve">135 W of 200 W externe </w:t>
       </w:r>
       <w:proofErr w:type="spellStart"/>
       <w:r>
-        <w:rPr>
-          <w:lang w:val="en-NL"/>
-        </w:rPr>
         <w:t>voeding</w:t>
       </w:r>
       <w:proofErr w:type="spellEnd"/>
       <w:r>
-        <w:rPr>
-          <w:lang w:val="en-NL"/>
-        </w:rPr>
         <w:t xml:space="preserve">, </w:t>
       </w:r>
       <w:proofErr w:type="spellStart"/>
       <w:r>
-        <w:rPr>
-          <w:lang w:val="en-NL"/>
-        </w:rPr>
         <w:t>beide</w:t>
       </w:r>
       <w:proofErr w:type="spellEnd"/>
       <w:r>
-        <w:rPr>
-          <w:lang w:val="en-NL"/>
-        </w:rPr>
         <w:t xml:space="preserve"> 89% </w:t>
       </w:r>
       <w:proofErr w:type="spellStart"/>
       <w:r>
-        <w:rPr>
-          <w:lang w:val="en-NL"/>
-        </w:rPr>
         <w:t>efficiënt</w:t>
       </w:r>
       <w:proofErr w:type="spellEnd"/>
       <w:r>
-        <w:rPr>
-          <w:lang w:val="en-NL"/>
-        </w:rPr>
         <w:t xml:space="preserve">, met active PFC </w:t>
       </w:r>
       <w:proofErr w:type="spellStart"/>
       <w:r>
-        <w:rPr>
-          <w:lang w:val="en-NL"/>
-        </w:rPr>
         <w:t>en</w:t>
       </w:r>
       <w:proofErr w:type="spellEnd"/>
       <w:r>
-        <w:rPr>
-          <w:lang w:val="en-NL"/>
-        </w:rPr>
         <w:t xml:space="preserve"> breed </w:t>
       </w:r>
       <w:proofErr w:type="spellStart"/>
       <w:r>
-        <w:rPr>
-          <w:lang w:val="en-NL"/>
-        </w:rPr>
         <w:t>ingangsbereik</w:t>
       </w:r>
       <w:proofErr w:type="spellEnd"/>
       <w:r>
-        <w:rPr>
-          <w:lang w:val="en-NL"/>
-        </w:rPr>
         <w:t xml:space="preserve">. </w:t>
       </w:r>
       <w:hyperlink r:id="rId12" w:tgtFrame="_blank" w:history="1">
         <w:r>
           <w:rPr>
             <w:rStyle w:val="Hyperlink"/>
-            <w:lang w:val="en-NL"/>
           </w:rPr>
           <w:t>B&amp;H Photo Video</w:t>
         </w:r>
       </w:hyperlink>
     </w:p>
     <w:p>
-      <w:pPr>
-        <w:rPr>
-          <w:lang w:val="en-NL"/>
-        </w:rPr>
-      </w:pPr>
-      <w:r>
-        <w:rPr>
-          <w:lang w:val="en-NL"/>
-        </w:rPr>
+      <w:r>
         <w:pict w14:anchorId="77AEE151">
-          <v:rect id="_x0000_i1085" style="width:0;height:1.5pt" o:hralign="center" o:hrstd="t" o:hr="t" fillcolor="#a0a0a0" stroked="f"/>
+          <v:rect id="_x0000_i1031" style="width:0;height:1.5pt" o:hralign="center" o:hrstd="t" o:hr="t" fillcolor="#a0a0a0" stroked="f"/>
         </w:pict>
       </w:r>
     </w:p>
@@ -2586,7 +2142,6 @@
         <w:rPr>
           <w:b/>
           <w:bCs/>
-          <w:lang w:val="en-NL"/>
         </w:rPr>
       </w:pPr>
       <w:proofErr w:type="spellStart"/>
@@ -2594,172 +2149,100 @@
         <w:rPr>
           <w:b/>
           <w:bCs/>
-          <w:lang w:val="en-NL"/>
         </w:rPr>
         <w:t>Beveiliging</w:t>
       </w:r>
       <w:proofErr w:type="spellEnd"/>
     </w:p>
     <w:p>
-      <w:pPr>
-        <w:rPr>
-          <w:lang w:val="en-NL"/>
-        </w:rPr>
-      </w:pPr>
-      <w:r>
-        <w:rPr>
-          <w:lang w:val="en-NL"/>
-        </w:rPr>
+      <w:r>
         <w:t xml:space="preserve">HP SureStart </w:t>
       </w:r>
       <w:proofErr w:type="spellStart"/>
       <w:r>
-        <w:rPr>
-          <w:lang w:val="en-NL"/>
-        </w:rPr>
         <w:t>voor</w:t>
       </w:r>
       <w:proofErr w:type="spellEnd"/>
       <w:r>
-        <w:rPr>
-          <w:lang w:val="en-NL"/>
-        </w:rPr>
         <w:t xml:space="preserve"> </w:t>
       </w:r>
       <w:proofErr w:type="spellStart"/>
       <w:r>
-        <w:rPr>
-          <w:lang w:val="en-NL"/>
-        </w:rPr>
         <w:t>geavanceerde</w:t>
       </w:r>
       <w:proofErr w:type="spellEnd"/>
       <w:r>
-        <w:rPr>
-          <w:lang w:val="en-NL"/>
-        </w:rPr>
         <w:t xml:space="preserve"> BIOS-</w:t>
       </w:r>
       <w:proofErr w:type="spellStart"/>
       <w:r>
-        <w:rPr>
-          <w:lang w:val="en-NL"/>
-        </w:rPr>
         <w:t>beveiliging</w:t>
       </w:r>
       <w:proofErr w:type="spellEnd"/>
       <w:r>
-        <w:rPr>
-          <w:lang w:val="en-NL"/>
-        </w:rPr>
         <w:t xml:space="preserve">, dual-purpose Kensington-slot </w:t>
       </w:r>
       <w:proofErr w:type="spellStart"/>
       <w:r>
-        <w:rPr>
-          <w:lang w:val="en-NL"/>
-        </w:rPr>
         <w:t>voor</w:t>
       </w:r>
       <w:proofErr w:type="spellEnd"/>
       <w:r>
-        <w:rPr>
-          <w:lang w:val="en-NL"/>
-        </w:rPr>
         <w:t xml:space="preserve"> chassis- </w:t>
       </w:r>
       <w:proofErr w:type="spellStart"/>
       <w:r>
-        <w:rPr>
-          <w:lang w:val="en-NL"/>
-        </w:rPr>
         <w:t>en</w:t>
       </w:r>
       <w:proofErr w:type="spellEnd"/>
       <w:r>
-        <w:rPr>
-          <w:lang w:val="en-NL"/>
-        </w:rPr>
         <w:t xml:space="preserve"> </w:t>
       </w:r>
       <w:proofErr w:type="spellStart"/>
       <w:r>
-        <w:rPr>
-          <w:lang w:val="en-NL"/>
-        </w:rPr>
         <w:t>unitbeveiliging</w:t>
       </w:r>
       <w:proofErr w:type="spellEnd"/>
       <w:r>
-        <w:rPr>
-          <w:lang w:val="en-NL"/>
-        </w:rPr>
         <w:t xml:space="preserve">, </w:t>
       </w:r>
       <w:proofErr w:type="spellStart"/>
       <w:r>
-        <w:rPr>
-          <w:lang w:val="en-NL"/>
-        </w:rPr>
         <w:t>en</w:t>
       </w:r>
       <w:proofErr w:type="spellEnd"/>
       <w:r>
-        <w:rPr>
-          <w:lang w:val="en-NL"/>
-        </w:rPr>
         <w:t xml:space="preserve"> </w:t>
       </w:r>
       <w:proofErr w:type="spellStart"/>
       <w:r>
-        <w:rPr>
-          <w:lang w:val="en-NL"/>
-        </w:rPr>
         <w:t>ondersteuning</w:t>
       </w:r>
       <w:proofErr w:type="spellEnd"/>
       <w:r>
-        <w:rPr>
-          <w:lang w:val="en-NL"/>
-        </w:rPr>
         <w:t xml:space="preserve"> </w:t>
       </w:r>
       <w:proofErr w:type="spellStart"/>
       <w:r>
-        <w:rPr>
-          <w:lang w:val="en-NL"/>
-        </w:rPr>
         <w:t>voor</w:t>
       </w:r>
       <w:proofErr w:type="spellEnd"/>
       <w:r>
-        <w:rPr>
-          <w:lang w:val="en-NL"/>
-        </w:rPr>
         <w:t xml:space="preserve"> USB-C. </w:t>
       </w:r>
       <w:hyperlink r:id="rId13" w:tgtFrame="_blank" w:history="1">
         <w:r>
           <w:rPr>
             <w:rStyle w:val="Hyperlink"/>
-            <w:lang w:val="en-NL"/>
           </w:rPr>
           <w:t>HP</w:t>
         </w:r>
       </w:hyperlink>
     </w:p>
     <w:p>
-      <w:pPr>
-        <w:rPr>
-          <w:lang w:val="en-NL"/>
-        </w:rPr>
-      </w:pPr>
-      <w:r>
-        <w:rPr>
-          <w:lang w:val="en-NL"/>
-        </w:rPr>
+      <w:r>
         <w:pict w14:anchorId="0B06D3BE">
-          <v:rect id="_x0000_i1086" style="width:0;height:1.5pt" o:hralign="center" o:hrstd="t" o:hr="t" fillcolor="#a0a0a0" stroked="f"/>
+          <v:rect id="_x0000_i1032" style="width:0;height:1.5pt" o:hralign="center" o:hrstd="t" o:hr="t" fillcolor="#a0a0a0" stroked="f"/>
         </w:pict>
       </w:r>
     </w:p>
@@ -2768,14 +2251,12 @@
         <w:rPr>
           <w:b/>
           <w:bCs/>
-          <w:lang w:val="en-NL"/>
         </w:rPr>
       </w:pPr>
       <w:r>
         <w:rPr>
           <w:b/>
           <w:bCs/>
-          <w:lang w:val="en-NL"/>
         </w:rPr>
         <w:t xml:space="preserve">Software &amp; </w:t>
       </w:r>
@@ -2784,121 +2265,72 @@
         <w:rPr>
           <w:b/>
           <w:bCs/>
-          <w:lang w:val="en-NL"/>
         </w:rPr>
         <w:t>certificering</w:t>
       </w:r>
       <w:proofErr w:type="spellEnd"/>
     </w:p>
     <w:p>
-      <w:pPr>
-        <w:rPr>
-          <w:lang w:val="en-NL"/>
-        </w:rPr>
-      </w:pPr>
-      <w:proofErr w:type="spellStart"/>
-      <w:r>
-        <w:rPr>
-          <w:lang w:val="en-NL"/>
-        </w:rPr>
+      <w:proofErr w:type="spellStart"/>
+      <w:r>
         <w:t>Meegeleverd</w:t>
       </w:r>
       <w:proofErr w:type="spellEnd"/>
       <w:r>
-        <w:rPr>
-          <w:lang w:val="en-NL"/>
-        </w:rPr>
         <w:t xml:space="preserve">: HP Performance Advisor, HP Remote Graphics Software 7.1, HP PC Hardware Diagnostics UEFI </w:t>
       </w:r>
       <w:proofErr w:type="spellStart"/>
       <w:r>
-        <w:rPr>
-          <w:lang w:val="en-NL"/>
-        </w:rPr>
         <w:t>en</w:t>
       </w:r>
       <w:proofErr w:type="spellEnd"/>
       <w:r>
-        <w:rPr>
-          <w:lang w:val="en-NL"/>
-        </w:rPr>
         <w:t xml:space="preserve"> HP Client Security Software. De Z2 Mini G3 is ISV-</w:t>
       </w:r>
       <w:proofErr w:type="spellStart"/>
       <w:r>
-        <w:rPr>
-          <w:lang w:val="en-NL"/>
-        </w:rPr>
         <w:t>gecertificeerd</w:t>
       </w:r>
       <w:proofErr w:type="spellEnd"/>
       <w:r>
-        <w:rPr>
-          <w:lang w:val="en-NL"/>
-        </w:rPr>
         <w:t xml:space="preserve"> </w:t>
       </w:r>
       <w:proofErr w:type="spellStart"/>
       <w:r>
-        <w:rPr>
-          <w:lang w:val="en-NL"/>
-        </w:rPr>
         <w:t>voor</w:t>
       </w:r>
       <w:proofErr w:type="spellEnd"/>
       <w:r>
-        <w:rPr>
-          <w:lang w:val="en-NL"/>
-        </w:rPr>
         <w:t xml:space="preserve"> </w:t>
       </w:r>
       <w:proofErr w:type="spellStart"/>
       <w:r>
-        <w:rPr>
-          <w:lang w:val="en-NL"/>
-        </w:rPr>
         <w:t>veelgebruikte</w:t>
       </w:r>
       <w:proofErr w:type="spellEnd"/>
       <w:r>
-        <w:rPr>
-          <w:lang w:val="en-NL"/>
-        </w:rPr>
         <w:t xml:space="preserve"> CAD-software </w:t>
       </w:r>
       <w:proofErr w:type="spellStart"/>
       <w:r>
-        <w:rPr>
-          <w:lang w:val="en-NL"/>
-        </w:rPr>
         <w:t>zoals</w:t>
       </w:r>
       <w:proofErr w:type="spellEnd"/>
       <w:r>
-        <w:rPr>
-          <w:lang w:val="en-NL"/>
-        </w:rPr>
         <w:t xml:space="preserve"> AutoCAD, SolidWorks, ArchiCAD </w:t>
       </w:r>
       <w:proofErr w:type="spellStart"/>
       <w:r>
-        <w:rPr>
-          <w:lang w:val="en-NL"/>
-        </w:rPr>
         <w:t>en</w:t>
       </w:r>
       <w:proofErr w:type="spellEnd"/>
       <w:r>
-        <w:rPr>
-          <w:lang w:val="en-NL"/>
-        </w:rPr>
         <w:t xml:space="preserve"> SketchUp. </w:t>
       </w:r>
       <w:hyperlink r:id="rId14" w:tgtFrame="_blank" w:history="1">
         <w:r>
           <w:rPr>
             <w:rStyle w:val="Hyperlink"/>
-            <w:lang w:val="en-NL"/>
           </w:rPr>
           <w:t xml:space="preserve">B&amp;H Photo </w:t>
         </w:r>
@@ -2906,7 +2338,6 @@
         <w:r>
           <w:rPr>
             <w:rStyle w:val="Hyperlink"/>
-            <w:lang w:val="en-NL"/>
           </w:rPr>
           <w:t>Video</w:t>
         </w:r>
@@ -2915,7 +2346,6 @@
         <w:r>
           <w:rPr>
             <w:rStyle w:val="Hyperlink"/>
-            <w:lang w:val="en-NL"/>
           </w:rPr>
           <w:t>Windows</w:t>
         </w:r>
@@ -2923,24 +2353,15 @@
         <w:r>
           <w:rPr>
             <w:rStyle w:val="Hyperlink"/>
-            <w:lang w:val="en-NL"/>
           </w:rPr>
           <w:t xml:space="preserve"> Central</w:t>
         </w:r>
       </w:hyperlink>
     </w:p>
     <w:p>
-      <w:pPr>
-        <w:rPr>
-          <w:lang w:val="en-NL"/>
-        </w:rPr>
-      </w:pPr>
-      <w:r>
-        <w:rPr>
-          <w:lang w:val="en-NL"/>
-        </w:rPr>
+      <w:r>
         <w:pict w14:anchorId="1FF5E87B">
-          <v:rect id="_x0000_i1087" style="width:0;height:1.5pt" o:hralign="center" o:hrstd="t" o:hr="t" fillcolor="#a0a0a0" stroked="f"/>
+          <v:rect id="_x0000_i1033" style="width:0;height:1.5pt" o:hralign="center" o:hrstd="t" o:hr="t" fillcolor="#a0a0a0" stroked="f"/>
         </w:pict>
       </w:r>
     </w:p>
@@ -2949,7 +2370,6 @@
         <w:rPr>
           <w:b/>
           <w:bCs/>
-          <w:lang w:val="en-NL"/>
         </w:rPr>
       </w:pPr>
       <w:proofErr w:type="spellStart"/>
@@ -2957,7 +2377,6 @@
         <w:rPr>
           <w:b/>
           <w:bCs/>
-          <w:lang w:val="en-NL"/>
         </w:rPr>
         <w:t>Garantie</w:t>
       </w:r>
@@ -2966,7 +2385,6 @@
         <w:rPr>
           <w:b/>
           <w:bCs/>
-          <w:lang w:val="en-NL"/>
         </w:rPr>
         <w:t xml:space="preserve"> &amp; </w:t>
       </w:r>
@@ -2975,212 +2393,122 @@
         <w:rPr>
           <w:b/>
           <w:bCs/>
-          <w:lang w:val="en-NL"/>
         </w:rPr>
         <w:t>betrouwbaarheid</w:t>
       </w:r>
       <w:proofErr w:type="spellEnd"/>
     </w:p>
     <w:p>
-      <w:pPr>
-        <w:rPr>
-          <w:lang w:val="en-NL"/>
-        </w:rPr>
-      </w:pPr>
-      <w:proofErr w:type="spellStart"/>
-      <w:r>
-        <w:rPr>
-          <w:lang w:val="en-NL"/>
-        </w:rPr>
+      <w:proofErr w:type="spellStart"/>
+      <w:r>
         <w:t>Getest</w:t>
       </w:r>
       <w:proofErr w:type="spellEnd"/>
       <w:r>
-        <w:rPr>
-          <w:lang w:val="en-NL"/>
-        </w:rPr>
         <w:t xml:space="preserve"> </w:t>
       </w:r>
       <w:proofErr w:type="spellStart"/>
       <w:r>
-        <w:rPr>
-          <w:lang w:val="en-NL"/>
-        </w:rPr>
         <w:t>voor</w:t>
       </w:r>
       <w:proofErr w:type="spellEnd"/>
       <w:r>
-        <w:rPr>
-          <w:lang w:val="en-NL"/>
-        </w:rPr>
         <w:t xml:space="preserve"> 368.000 </w:t>
       </w:r>
       <w:proofErr w:type="spellStart"/>
       <w:r>
-        <w:rPr>
-          <w:lang w:val="en-NL"/>
-        </w:rPr>
         <w:t>uur</w:t>
       </w:r>
       <w:proofErr w:type="spellEnd"/>
       <w:r>
-        <w:rPr>
-          <w:lang w:val="en-NL"/>
-        </w:rPr>
         <w:t xml:space="preserve"> </w:t>
       </w:r>
       <w:proofErr w:type="spellStart"/>
       <w:r>
-        <w:rPr>
-          <w:lang w:val="en-NL"/>
-        </w:rPr>
         <w:t>en</w:t>
       </w:r>
       <w:proofErr w:type="spellEnd"/>
       <w:r>
-        <w:rPr>
-          <w:lang w:val="en-NL"/>
-        </w:rPr>
         <w:t xml:space="preserve"> </w:t>
       </w:r>
       <w:proofErr w:type="spellStart"/>
       <w:r>
-        <w:rPr>
-          <w:lang w:val="en-NL"/>
-        </w:rPr>
         <w:t>gecertificeerd</w:t>
       </w:r>
       <w:proofErr w:type="spellEnd"/>
       <w:r>
-        <w:rPr>
-          <w:lang w:val="en-NL"/>
-        </w:rPr>
         <w:t xml:space="preserve"> </w:t>
       </w:r>
       <w:proofErr w:type="spellStart"/>
       <w:r>
-        <w:rPr>
-          <w:lang w:val="en-NL"/>
-        </w:rPr>
         <w:t>voor</w:t>
       </w:r>
       <w:proofErr w:type="spellEnd"/>
       <w:r>
-        <w:rPr>
-          <w:lang w:val="en-NL"/>
-        </w:rPr>
         <w:t xml:space="preserve"> </w:t>
       </w:r>
       <w:proofErr w:type="spellStart"/>
       <w:r>
-        <w:rPr>
-          <w:lang w:val="en-NL"/>
-        </w:rPr>
         <w:t>populaire</w:t>
       </w:r>
       <w:proofErr w:type="spellEnd"/>
       <w:r>
-        <w:rPr>
-          <w:lang w:val="en-NL"/>
-        </w:rPr>
         <w:t xml:space="preserve"> CAD-</w:t>
       </w:r>
       <w:proofErr w:type="spellStart"/>
       <w:r>
-        <w:rPr>
-          <w:lang w:val="en-NL"/>
-        </w:rPr>
         <w:t>softwaretitels</w:t>
       </w:r>
       <w:proofErr w:type="spellEnd"/>
       <w:r>
-        <w:rPr>
-          <w:lang w:val="en-NL"/>
-        </w:rPr>
         <w:t xml:space="preserve">. </w:t>
       </w:r>
       <w:proofErr w:type="spellStart"/>
       <w:r>
-        <w:rPr>
-          <w:lang w:val="en-NL"/>
-        </w:rPr>
         <w:t>Standaard</w:t>
       </w:r>
       <w:proofErr w:type="spellEnd"/>
       <w:r>
-        <w:rPr>
-          <w:lang w:val="en-NL"/>
-        </w:rPr>
         <w:t xml:space="preserve"> 3 </w:t>
       </w:r>
       <w:proofErr w:type="spellStart"/>
       <w:r>
-        <w:rPr>
-          <w:lang w:val="en-NL"/>
-        </w:rPr>
         <w:t>jaar</w:t>
       </w:r>
       <w:proofErr w:type="spellEnd"/>
       <w:r>
-        <w:rPr>
-          <w:lang w:val="en-NL"/>
-        </w:rPr>
         <w:t xml:space="preserve"> </w:t>
       </w:r>
       <w:proofErr w:type="spellStart"/>
       <w:r>
-        <w:rPr>
-          <w:lang w:val="en-NL"/>
-        </w:rPr>
         <w:t>garantie</w:t>
       </w:r>
       <w:proofErr w:type="spellEnd"/>
       <w:r>
-        <w:rPr>
-          <w:lang w:val="en-NL"/>
-        </w:rPr>
         <w:t xml:space="preserve"> (</w:t>
       </w:r>
       <w:proofErr w:type="spellStart"/>
       <w:r>
-        <w:rPr>
-          <w:lang w:val="en-NL"/>
-        </w:rPr>
         <w:t>onderdelen</w:t>
       </w:r>
       <w:proofErr w:type="spellEnd"/>
       <w:r>
-        <w:rPr>
-          <w:lang w:val="en-NL"/>
-        </w:rPr>
         <w:t xml:space="preserve">, </w:t>
       </w:r>
       <w:proofErr w:type="spellStart"/>
       <w:r>
-        <w:rPr>
-          <w:lang w:val="en-NL"/>
-        </w:rPr>
         <w:t>arbeid</w:t>
       </w:r>
       <w:proofErr w:type="spellEnd"/>
       <w:r>
-        <w:rPr>
-          <w:lang w:val="en-NL"/>
-        </w:rPr>
         <w:t xml:space="preserve"> </w:t>
       </w:r>
       <w:proofErr w:type="spellStart"/>
       <w:r>
-        <w:rPr>
-          <w:lang w:val="en-NL"/>
-        </w:rPr>
         <w:t>en</w:t>
       </w:r>
       <w:proofErr w:type="spellEnd"/>
       <w:r>
-        <w:rPr>
-          <w:lang w:val="en-NL"/>
-        </w:rPr>
         <w:t xml:space="preserve"> on-site).</w:t>
       </w:r>
     </w:p>
@@ -3270,138 +2598,124 @@
     </w:p>
     <w:p>
       <w:pPr>
+        <w:rPr>
+          <w:lang w:val="nl-NL"/>
+        </w:rPr>
+      </w:pPr>
+    </w:p>
+    <w:p>
+      <w:pPr>
+        <w:rPr>
+          <w:lang w:val="nl-NL"/>
+        </w:rPr>
+      </w:pPr>
+    </w:p>
+    <w:p>
+      <w:pPr>
+        <w:rPr>
+          <w:lang w:val="nl-NL"/>
+        </w:rPr>
+      </w:pPr>
+    </w:p>
+    <w:p>
+      <w:pPr>
+        <w:rPr>
+          <w:lang w:val="nl-NL"/>
+        </w:rPr>
+      </w:pPr>
+    </w:p>
+    <w:p>
+      <w:pPr>
+        <w:rPr>
+          <w:lang w:val="nl-NL"/>
+        </w:rPr>
+      </w:pPr>
+    </w:p>
+    <w:p>
+      <w:pPr>
+        <w:rPr>
+          <w:lang w:val="nl-NL"/>
+        </w:rPr>
+      </w:pPr>
+    </w:p>
+    <w:p>
+      <w:pPr>
+        <w:rPr>
+          <w:lang w:val="nl-NL"/>
+        </w:rPr>
+      </w:pPr>
+    </w:p>
+    <w:p>
+      <w:pPr>
+        <w:rPr>
+          <w:lang w:val="nl-NL"/>
+        </w:rPr>
+      </w:pPr>
+    </w:p>
+    <w:p>
+      <w:pPr>
+        <w:rPr>
+          <w:lang w:val="nl-NL"/>
+        </w:rPr>
+      </w:pPr>
+    </w:p>
+    <w:p>
+      <w:pPr>
+        <w:rPr>
+          <w:lang w:val="nl-NL"/>
+        </w:rPr>
+      </w:pPr>
+    </w:p>
+    <w:p>
+      <w:pPr>
+        <w:rPr>
+          <w:lang w:val="nl-NL"/>
+        </w:rPr>
+      </w:pPr>
+    </w:p>
+    <w:p>
+      <w:pPr>
+        <w:rPr>
+          <w:lang w:val="nl-NL"/>
+        </w:rPr>
+      </w:pPr>
+    </w:p>
+    <w:p>
+      <w:pPr>
+        <w:pStyle w:val="Kop2"/>
+        <w:rPr>
+          <w:lang w:val="nl-NL"/>
+        </w:rPr>
+      </w:pPr>
+      <w:bookmarkStart w:id="7" w:name="_Toc213239207"/>
+      <w:r>
+        <w:rPr>
+          <w:lang w:val="nl-NL"/>
+        </w:rPr>
+        <w:t>server</w:t>
+      </w:r>
+      <w:bookmarkEnd w:id="7"/>
+    </w:p>
+    <w:p>
+      <w:pPr>
+        <w:rPr>
+          <w:lang w:val="nl-NL"/>
+        </w:rPr>
+      </w:pPr>
+    </w:p>
+    <w:p>
+      <w:pPr>
         <w:pStyle w:val="Kop3"/>
         <w:rPr>
           <w:lang w:val="nl-NL"/>
         </w:rPr>
       </w:pPr>
-      <w:bookmarkStart w:id="7" w:name="_Toc213239206"/>
-      <w:r>
-        <w:rPr>
-          <w:lang w:val="nl-NL"/>
-        </w:rPr>
-        <w:t>verwacht resultaat</w:t>
-      </w:r>
-      <w:bookmarkEnd w:id="7"/>
-    </w:p>
-    <w:p>
-      <w:pPr>
-        <w:rPr>
-          <w:lang w:val="nl-NL"/>
-        </w:rPr>
-      </w:pPr>
-    </w:p>
-    <w:p>
-      <w:pPr>
-        <w:rPr>
-          <w:lang w:val="nl-NL"/>
-        </w:rPr>
-      </w:pPr>
-    </w:p>
-    <w:p>
-      <w:pPr>
-        <w:rPr>
-          <w:lang w:val="nl-NL"/>
-        </w:rPr>
-      </w:pPr>
-    </w:p>
-    <w:p>
-      <w:pPr>
-        <w:rPr>
-          <w:lang w:val="nl-NL"/>
-        </w:rPr>
-      </w:pPr>
-    </w:p>
-    <w:p>
-      <w:pPr>
-        <w:rPr>
-          <w:lang w:val="nl-NL"/>
-        </w:rPr>
-      </w:pPr>
-    </w:p>
-    <w:p>
-      <w:pPr>
-        <w:rPr>
-          <w:lang w:val="nl-NL"/>
-        </w:rPr>
-      </w:pPr>
-    </w:p>
-    <w:p>
-      <w:pPr>
-        <w:rPr>
-          <w:lang w:val="nl-NL"/>
-        </w:rPr>
-      </w:pPr>
-    </w:p>
-    <w:p>
-      <w:pPr>
-        <w:rPr>
-          <w:lang w:val="nl-NL"/>
-        </w:rPr>
-      </w:pPr>
-    </w:p>
-    <w:p>
-      <w:pPr>
-        <w:rPr>
-          <w:lang w:val="nl-NL"/>
-        </w:rPr>
-      </w:pPr>
-    </w:p>
-    <w:p>
-      <w:pPr>
-        <w:rPr>
-          <w:lang w:val="nl-NL"/>
-        </w:rPr>
-      </w:pPr>
-    </w:p>
-    <w:p>
-      <w:pPr>
-        <w:rPr>
-          <w:lang w:val="nl-NL"/>
-        </w:rPr>
-      </w:pPr>
-    </w:p>
-    <w:p>
-      <w:pPr>
-        <w:rPr>
-          <w:lang w:val="nl-NL"/>
-        </w:rPr>
-      </w:pPr>
-    </w:p>
-    <w:p>
-      <w:pPr>
-        <w:rPr>
-          <w:lang w:val="nl-NL"/>
-        </w:rPr>
-      </w:pPr>
-    </w:p>
-    <w:p>
-      <w:pPr>
-        <w:rPr>
-          <w:lang w:val="nl-NL"/>
-        </w:rPr>
-      </w:pPr>
-    </w:p>
-    <w:p>
-      <w:pPr>
-        <w:rPr>
-          <w:lang w:val="nl-NL"/>
-        </w:rPr>
-      </w:pPr>
-    </w:p>
-    <w:p>
-      <w:pPr>
-        <w:pStyle w:val="Kop2"/>
-        <w:rPr>
-          <w:lang w:val="nl-NL"/>
-        </w:rPr>
-      </w:pPr>
-      <w:bookmarkStart w:id="8" w:name="_Toc213239207"/>
-      <w:r>
-        <w:rPr>
-          <w:lang w:val="nl-NL"/>
-        </w:rPr>
-        <w:t>server</w:t>
+      <w:bookmarkStart w:id="8" w:name="_Toc213239208"/>
+      <w:r>
+        <w:rPr>
+          <w:lang w:val="nl-NL"/>
+        </w:rPr>
+        <w:t>Hardware</w:t>
       </w:r>
       <w:bookmarkEnd w:id="8"/>
     </w:p>
@@ -3414,17 +2728,24 @@
     </w:p>
     <w:p>
       <w:pPr>
+        <w:rPr>
+          <w:lang w:val="nl-NL"/>
+        </w:rPr>
+      </w:pPr>
+    </w:p>
+    <w:p>
+      <w:pPr>
         <w:pStyle w:val="Kop3"/>
         <w:rPr>
           <w:lang w:val="nl-NL"/>
         </w:rPr>
       </w:pPr>
-      <w:bookmarkStart w:id="9" w:name="_Toc213239208"/>
-      <w:r>
-        <w:rPr>
-          <w:lang w:val="nl-NL"/>
-        </w:rPr>
-        <w:t>Hardware</w:t>
+      <w:bookmarkStart w:id="9" w:name="_Toc213239209"/>
+      <w:r>
+        <w:rPr>
+          <w:lang w:val="nl-NL"/>
+        </w:rPr>
+        <w:t>Software</w:t>
       </w:r>
       <w:bookmarkEnd w:id="9"/>
     </w:p>
@@ -3441,36 +2762,6 @@
           <w:lang w:val="nl-NL"/>
         </w:rPr>
       </w:pPr>
-    </w:p>
-    <w:p>
-      <w:pPr>
-        <w:pStyle w:val="Kop3"/>
-        <w:rPr>
-          <w:lang w:val="nl-NL"/>
-        </w:rPr>
-      </w:pPr>
-      <w:bookmarkStart w:id="10" w:name="_Toc213239209"/>
-      <w:r>
-        <w:rPr>
-          <w:lang w:val="nl-NL"/>
-        </w:rPr>
-        <w:t>Software</w:t>
-      </w:r>
-      <w:bookmarkEnd w:id="10"/>
-    </w:p>
-    <w:p>
-      <w:pPr>
-        <w:rPr>
-          <w:lang w:val="nl-NL"/>
-        </w:rPr>
-      </w:pPr>
-    </w:p>
-    <w:p>
-      <w:pPr>
-        <w:rPr>
-          <w:lang w:val="nl-NL"/>
-        </w:rPr>
-      </w:pPr>
       <w:r>
         <w:rPr>
           <w:lang w:val="nl-NL"/>
@@ -3491,22 +2782,6 @@
           <w:lang w:val="nl-NL"/>
         </w:rPr>
       </w:pPr>
-    </w:p>
-    <w:p>
-      <w:pPr>
-        <w:pStyle w:val="Kop3"/>
-        <w:rPr>
-          <w:lang w:val="nl-NL"/>
-        </w:rPr>
-      </w:pPr>
-      <w:bookmarkStart w:id="11" w:name="_Toc213239210"/>
-      <w:r>
-        <w:rPr>
-          <w:lang w:val="nl-NL"/>
-        </w:rPr>
-        <w:t>verwacht resultaat</w:t>
-      </w:r>
-      <w:bookmarkEnd w:id="11"/>
     </w:p>
     <w:p>
       <w:pPr>
@@ -4133,6 +3408,7 @@
   <w:style w:type="character" w:default="1" w:styleId="Standaardalinea-lettertype">
     <w:name w:val="Default Paragraph Font"/>
     <w:uiPriority w:val="1"/>
+    <w:semiHidden/>
     <w:unhideWhenUsed/>
   </w:style>
   <w:style w:type="table" w:default="1" w:styleId="Standaardtabel">

</xml_diff>